<commit_message>
Add structured Supabase mirror tables
</commit_message>
<xml_diff>
--- a/docs/frontend/LIYANS_VASTRA_Supabase_DB_Implementation_Plan.docx
+++ b/docs/frontend/LIYANS_VASTRA_Supabase_DB_Implementation_Plan.docx
@@ -618,6 +618,307 @@
         <w:t>Frontend admin Save To Supabase shows success when backend env variables are configured.</w:t>
       </w:r>
     </w:p>
+    <w:p>
+      <w:r>
+        <w:br w:type="page"/>
+      </w:r>
+    </w:p>
+    <w:p>
+      <w:pPr>
+        <w:pStyle w:val="Heading1"/>
+      </w:pPr>
+      <w:r>
+        <w:t>9. Structured Table Update</w:t>
+      </w:r>
+    </w:p>
+    <w:p>
+      <w:r>
+        <w:t>The database has been extended beyond the original JSON content table. Page content and image/container details are now stored as separate attributes for easier querying, reporting, and future admin features.</w:t>
+      </w:r>
+    </w:p>
+    <w:tbl>
+      <w:tblPr>
+        <w:tblW w:type="auto" w:w="0"/>
+        <w:tblLook w:firstColumn="1" w:firstRow="1" w:lastColumn="0" w:lastRow="0" w:noHBand="0" w:noVBand="1" w:val="04A0"/>
+      </w:tblPr>
+      <w:tblGrid>
+        <w:gridCol w:w="2160"/>
+        <w:gridCol w:w="2160"/>
+        <w:gridCol w:w="2160"/>
+        <w:gridCol w:w="2160"/>
+      </w:tblGrid>
+      <w:tr>
+        <w:tc>
+          <w:tcPr>
+            <w:tcW w:type="dxa" w:w="2160"/>
+          </w:tcPr>
+          <w:p>
+            <w:r>
+              <w:t>Table</w:t>
+            </w:r>
+          </w:p>
+        </w:tc>
+        <w:tc>
+          <w:tcPr>
+            <w:tcW w:type="dxa" w:w="2160"/>
+          </w:tcPr>
+          <w:p>
+            <w:r>
+              <w:t>Role</w:t>
+            </w:r>
+          </w:p>
+        </w:tc>
+        <w:tc>
+          <w:tcPr>
+            <w:tcW w:type="dxa" w:w="2160"/>
+          </w:tcPr>
+          <w:p>
+            <w:r>
+              <w:t>Editable?</w:t>
+            </w:r>
+          </w:p>
+        </w:tc>
+        <w:tc>
+          <w:tcPr>
+            <w:tcW w:type="dxa" w:w="2160"/>
+          </w:tcPr>
+          <w:p>
+            <w:r>
+              <w:t>Important Attributes</w:t>
+            </w:r>
+          </w:p>
+        </w:tc>
+      </w:tr>
+      <w:tr>
+        <w:tc>
+          <w:tcPr>
+            <w:tcW w:type="dxa" w:w="2160"/>
+          </w:tcPr>
+          <w:p>
+            <w:r>
+              <w:t>site_pages_current</w:t>
+            </w:r>
+          </w:p>
+        </w:tc>
+        <w:tc>
+          <w:tcPr>
+            <w:tcW w:type="dxa" w:w="2160"/>
+          </w:tcPr>
+          <w:p>
+            <w:r>
+              <w:t>DB-1 current page text store</w:t>
+            </w:r>
+          </w:p>
+        </w:tc>
+        <w:tc>
+          <w:tcPr>
+            <w:tcW w:type="dxa" w:w="2160"/>
+          </w:tcPr>
+          <w:p>
+            <w:r>
+              <w:t>Yes</w:t>
+            </w:r>
+          </w:p>
+        </w:tc>
+        <w:tc>
+          <w:tcPr>
+            <w:tcW w:type="dxa" w:w="2160"/>
+          </w:tcPr>
+          <w:p>
+            <w:r>
+              <w:t>page_key, page_name, title, subtitle, body, updated_at</w:t>
+            </w:r>
+          </w:p>
+        </w:tc>
+      </w:tr>
+      <w:tr>
+        <w:tc>
+          <w:tcPr>
+            <w:tcW w:type="dxa" w:w="2160"/>
+          </w:tcPr>
+          <w:p>
+            <w:r>
+              <w:t>image_containers_current</w:t>
+            </w:r>
+          </w:p>
+        </w:tc>
+        <w:tc>
+          <w:tcPr>
+            <w:tcW w:type="dxa" w:w="2160"/>
+          </w:tcPr>
+          <w:p>
+            <w:r>
+              <w:t>DB-1 current image/container store</w:t>
+            </w:r>
+          </w:p>
+        </w:tc>
+        <w:tc>
+          <w:tcPr>
+            <w:tcW w:type="dxa" w:w="2160"/>
+          </w:tcPr>
+          <w:p>
+            <w:r>
+              <w:t>Yes</w:t>
+            </w:r>
+          </w:p>
+        </w:tc>
+        <w:tc>
+          <w:tcPr>
+            <w:tcW w:type="dxa" w:w="2160"/>
+          </w:tcPr>
+          <w:p>
+            <w:r>
+              <w:t>name, brand_name, category_name, group_name, description, cloth_style, fabric, rating, rate, front_image, back_image</w:t>
+            </w:r>
+          </w:p>
+        </w:tc>
+      </w:tr>
+      <w:tr>
+        <w:tc>
+          <w:tcPr>
+            <w:tcW w:type="dxa" w:w="2160"/>
+          </w:tcPr>
+          <w:p>
+            <w:r>
+              <w:t>site_pages_mirror</w:t>
+            </w:r>
+          </w:p>
+        </w:tc>
+        <w:tc>
+          <w:tcPr>
+            <w:tcW w:type="dxa" w:w="2160"/>
+          </w:tcPr>
+          <w:p>
+            <w:r>
+              <w:t>DB-2 append-only page mirror</w:t>
+            </w:r>
+          </w:p>
+        </w:tc>
+        <w:tc>
+          <w:tcPr>
+            <w:tcW w:type="dxa" w:w="2160"/>
+          </w:tcPr>
+          <w:p>
+            <w:r>
+              <w:t>No app edit/delete route</w:t>
+            </w:r>
+          </w:p>
+        </w:tc>
+        <w:tc>
+          <w:tcPr>
+            <w:tcW w:type="dxa" w:w="2160"/>
+          </w:tcPr>
+          <w:p>
+            <w:r>
+              <w:t>edit_label, page_key, title, subtitle, body, created_at</w:t>
+            </w:r>
+          </w:p>
+        </w:tc>
+      </w:tr>
+      <w:tr>
+        <w:tc>
+          <w:tcPr>
+            <w:tcW w:type="dxa" w:w="2160"/>
+          </w:tcPr>
+          <w:p>
+            <w:r>
+              <w:t>image_containers_mirror</w:t>
+            </w:r>
+          </w:p>
+        </w:tc>
+        <w:tc>
+          <w:tcPr>
+            <w:tcW w:type="dxa" w:w="2160"/>
+          </w:tcPr>
+          <w:p>
+            <w:r>
+              <w:t>DB-2 append-only image/container mirror</w:t>
+            </w:r>
+          </w:p>
+        </w:tc>
+        <w:tc>
+          <w:tcPr>
+            <w:tcW w:type="dxa" w:w="2160"/>
+          </w:tcPr>
+          <w:p>
+            <w:r>
+              <w:t>No app edit/delete route</w:t>
+            </w:r>
+          </w:p>
+        </w:tc>
+        <w:tc>
+          <w:tcPr>
+            <w:tcW w:type="dxa" w:w="2160"/>
+          </w:tcPr>
+          <w:p>
+            <w:r>
+              <w:t>edit_label, container_id, category_name, group_name, name, brand_name, image fields, created_at</w:t>
+            </w:r>
+          </w:p>
+        </w:tc>
+      </w:tr>
+    </w:tbl>
+    <w:p>
+      <w:pPr>
+        <w:pStyle w:val="Heading1"/>
+      </w:pPr>
+      <w:r>
+        <w:t>10. Tested Supabase Counts</w:t>
+      </w:r>
+    </w:p>
+    <w:p>
+      <w:pPr>
+        <w:pStyle w:val="ListBullet"/>
+      </w:pPr>
+      <w:r>
+        <w:t>site_content_current: 1 row</w:t>
+      </w:r>
+    </w:p>
+    <w:p>
+      <w:pPr>
+        <w:pStyle w:val="ListBullet"/>
+      </w:pPr>
+      <w:r>
+        <w:t>site_content_backup: 3 rows after seed and API save tests</w:t>
+      </w:r>
+    </w:p>
+    <w:p>
+      <w:pPr>
+        <w:pStyle w:val="ListBullet"/>
+      </w:pPr>
+      <w:r>
+        <w:t>site_pages_current: 4 rows for Home, About, Services, Contact</w:t>
+      </w:r>
+    </w:p>
+    <w:p>
+      <w:pPr>
+        <w:pStyle w:val="ListBullet"/>
+      </w:pPr>
+      <w:r>
+        <w:t>image_containers_current: 12 rows for category cards and group image containers</w:t>
+      </w:r>
+    </w:p>
+    <w:p>
+      <w:pPr>
+        <w:pStyle w:val="ListBullet"/>
+      </w:pPr>
+      <w:r>
+        <w:t>site_pages_mirror: append-only mirror rows created with edit labels</w:t>
+      </w:r>
+    </w:p>
+    <w:p>
+      <w:pPr>
+        <w:pStyle w:val="ListBullet"/>
+      </w:pPr>
+      <w:r>
+        <w:t>image_containers_mirror: append-only mirror rows created with edit labels</w:t>
+      </w:r>
+    </w:p>
+    <w:p>
+      <w:r>
+        <w:t>Every admin save now updates DB-1 current tables and inserts a new edit-labelled snapshot into DB-2 mirror tables. DB-2 remains store-only from the application because no edit/delete endpoint is provided for mirror tables.</w:t>
+      </w:r>
+    </w:p>
     <w:sectPr>
       <w:pgSz w:w="12240" w:h="15840"/>
       <w:pgMar w:top="1440" w:right="1800" w:bottom="1440" w:left="1800" w:header="720" w:footer="720" w:gutter="0"/>

</xml_diff>

<commit_message>
Store contact email messages in Supabase
</commit_message>
<xml_diff>
--- a/docs/frontend/LIYANS_VASTRA_Supabase_DB_Implementation_Plan.docx
+++ b/docs/frontend/LIYANS_VASTRA_Supabase_DB_Implementation_Plan.docx
@@ -919,6 +919,189 @@
         <w:t>Every admin save now updates DB-1 current tables and inserts a new edit-labelled snapshot into DB-2 mirror tables. DB-2 remains store-only from the application because no edit/delete endpoint is provided for mirror tables.</w:t>
       </w:r>
     </w:p>
+    <w:p>
+      <w:r>
+        <w:br w:type="page"/>
+      </w:r>
+    </w:p>
+    <w:p>
+      <w:pPr>
+        <w:pStyle w:val="Heading1"/>
+      </w:pPr>
+      <w:r>
+        <w:t>11. Contact Email Message Table Update</w:t>
+      </w:r>
+    </w:p>
+    <w:p>
+      <w:r>
+        <w:t>A new table has been added to store website contact/email submissions. The backend contact API records each message attempt with sent, failed, or test status when Supabase is configured.</w:t>
+      </w:r>
+    </w:p>
+    <w:tbl>
+      <w:tblPr>
+        <w:tblW w:type="auto" w:w="0"/>
+        <w:tblLook w:firstColumn="1" w:firstRow="1" w:lastColumn="0" w:lastRow="0" w:noHBand="0" w:noVBand="1" w:val="04A0"/>
+      </w:tblPr>
+      <w:tblGrid>
+        <w:gridCol w:w="2160"/>
+        <w:gridCol w:w="2160"/>
+        <w:gridCol w:w="2160"/>
+        <w:gridCol w:w="2160"/>
+      </w:tblGrid>
+      <w:tr>
+        <w:tc>
+          <w:tcPr>
+            <w:tcW w:type="dxa" w:w="2160"/>
+          </w:tcPr>
+          <w:p>
+            <w:r>
+              <w:t>Table</w:t>
+            </w:r>
+          </w:p>
+        </w:tc>
+        <w:tc>
+          <w:tcPr>
+            <w:tcW w:type="dxa" w:w="2160"/>
+          </w:tcPr>
+          <w:p>
+            <w:r>
+              <w:t>Purpose</w:t>
+            </w:r>
+          </w:p>
+        </w:tc>
+        <w:tc>
+          <w:tcPr>
+            <w:tcW w:type="dxa" w:w="2160"/>
+          </w:tcPr>
+          <w:p>
+            <w:r>
+              <w:t>Editable?</w:t>
+            </w:r>
+          </w:p>
+        </w:tc>
+        <w:tc>
+          <w:tcPr>
+            <w:tcW w:type="dxa" w:w="2160"/>
+          </w:tcPr>
+          <w:p>
+            <w:r>
+              <w:t>Important Attributes</w:t>
+            </w:r>
+          </w:p>
+        </w:tc>
+      </w:tr>
+      <w:tr>
+        <w:tc>
+          <w:tcPr>
+            <w:tcW w:type="dxa" w:w="2160"/>
+          </w:tcPr>
+          <w:p>
+            <w:r>
+              <w:t>contact_email_messages</w:t>
+            </w:r>
+          </w:p>
+        </w:tc>
+        <w:tc>
+          <w:tcPr>
+            <w:tcW w:type="dxa" w:w="2160"/>
+          </w:tcPr>
+          <w:p>
+            <w:r>
+              <w:t>Stores contact form/email message submissions and send status.</w:t>
+            </w:r>
+          </w:p>
+        </w:tc>
+        <w:tc>
+          <w:tcPr>
+            <w:tcW w:type="dxa" w:w="2160"/>
+          </w:tcPr>
+          <w:p>
+            <w:r>
+              <w:t>Insert by API; can be used for reporting.</w:t>
+            </w:r>
+          </w:p>
+        </w:tc>
+        <w:tc>
+          <w:tcPr>
+            <w:tcW w:type="dxa" w:w="2160"/>
+          </w:tcPr>
+          <w:p>
+            <w:r>
+              <w:t>name, email, subject, message, status, provider, error_message, created_at</w:t>
+            </w:r>
+          </w:p>
+        </w:tc>
+      </w:tr>
+    </w:tbl>
+    <w:p>
+      <w:pPr>
+        <w:pStyle w:val="Heading1"/>
+      </w:pPr>
+      <w:r>
+        <w:t>12. Latest Database Test Report</w:t>
+      </w:r>
+    </w:p>
+    <w:p>
+      <w:pPr>
+        <w:pStyle w:val="ListBullet"/>
+      </w:pPr>
+      <w:r>
+        <w:t>site_content_current: 1 row</w:t>
+      </w:r>
+    </w:p>
+    <w:p>
+      <w:pPr>
+        <w:pStyle w:val="ListBullet"/>
+      </w:pPr>
+      <w:r>
+        <w:t>site_content_backup: 3 rows</w:t>
+      </w:r>
+    </w:p>
+    <w:p>
+      <w:pPr>
+        <w:pStyle w:val="ListBullet"/>
+      </w:pPr>
+      <w:r>
+        <w:t>site_pages_current: 4 rows</w:t>
+      </w:r>
+    </w:p>
+    <w:p>
+      <w:pPr>
+        <w:pStyle w:val="ListBullet"/>
+      </w:pPr>
+      <w:r>
+        <w:t>image_containers_current: 12 rows</w:t>
+      </w:r>
+    </w:p>
+    <w:p>
+      <w:pPr>
+        <w:pStyle w:val="ListBullet"/>
+      </w:pPr>
+      <w:r>
+        <w:t>site_pages_mirror: 8 rows</w:t>
+      </w:r>
+    </w:p>
+    <w:p>
+      <w:pPr>
+        <w:pStyle w:val="ListBullet"/>
+      </w:pPr>
+      <w:r>
+        <w:t>image_containers_mirror: 24 rows</w:t>
+      </w:r>
+    </w:p>
+    <w:p>
+      <w:pPr>
+        <w:pStyle w:val="ListBullet"/>
+      </w:pPr>
+      <w:r>
+        <w:t>contact_email_messages: 2 test rows</w:t>
+      </w:r>
+    </w:p>
+    <w:p>
+      <w:r>
+        <w:t>Sample contact message verified: Test Customer / test@example.com / Supabase contact message test / status=test / provider=manual-test.</w:t>
+      </w:r>
+    </w:p>
     <w:sectPr>
       <w:pgSz w:w="12240" w:h="15840"/>
       <w:pgMar w:top="1440" w:right="1800" w:bottom="1440" w:left="1800" w:header="720" w:footer="720" w:gutter="0"/>

</xml_diff>